<commit_message>
Update ML Explainer doc: add Pareto, Warehouse Risk, and XAI sections (Secs 7-9)
</commit_message>
<xml_diff>
--- a/ML_Expiry_Classifier_Explainer.docx
+++ b/ML_Expiry_Classifier_Explainer.docx
@@ -3386,7 +3386,20 @@
           <w:b/>
           <w:color w:val="1F3864"/>
         </w:rPr>
-        <w:t>7. Model Performance — How to Read the Metrics</w:t>
+        <w:t>7. SKU Pareto Analysis — Which Products Drive 80% of Expiry Risk?</w:t>
+      </w:r>
+    </w:p>
+    <w:p>
+      <w:pPr>
+        <w:spacing w:after="160" w:line="360" w:lineRule="auto"/>
+      </w:pPr>
+      <w:r>
+        <w:rPr>
+          <w:b w:val="0"/>
+          <w:i w:val="0"/>
+          <w:sz w:val="22"/>
+        </w:rPr>
+        <w:t>The Pareto Principle (80/20 rule) is one of the most powerful and consistently validated observations in supply chain management: in virtually every pharmaceutical inventory portfolio, approximately 20% of SKUs account for 80% of total expiry-related financial risk. The PharmaTrace ML classifier uses this principle to prioritise management attention and avoid 'spray-and-pray' interventions across the entire portfolio.</w:t>
       </w:r>
     </w:p>
     <w:p>
@@ -3399,7 +3412,1589 @@
           <w:b/>
           <w:color w:val="1F3864"/>
         </w:rPr>
-        <w:t>7.1 Metric Definitions</w:t>
+        <w:t>7.1 What the Pareto Chart Shows</w:t>
+      </w:r>
+    </w:p>
+    <w:p>
+      <w:pPr>
+        <w:spacing w:after="160" w:line="360" w:lineRule="auto"/>
+      </w:pPr>
+      <w:r>
+        <w:rPr>
+          <w:b w:val="0"/>
+          <w:i w:val="0"/>
+          <w:sz w:val="22"/>
+        </w:rPr>
+        <w:t>The Pareto chart ranks every SKU from highest to lowest at-risk inventory value (red bars, left axis). A cumulative percentage line (right axis) shows what fraction of total at-risk capital is accounted for as SKUs are added from left to right. The green dashed line marks the 80% threshold — the point at which the fewest SKUs account for the largest share of risk.</w:t>
+      </w:r>
+    </w:p>
+    <w:p>
+      <w:pPr>
+        <w:pStyle w:val="ListBullet"/>
+        <w:spacing w:after="80"/>
+        <w:ind w:left="360"/>
+      </w:pPr>
+      <w:r>
+        <w:rPr>
+          <w:sz w:val="22"/>
+        </w:rPr>
+        <w:t>Red bars (left axis): At-risk inventory value per SKU, sorted largest to smallest. Only batches the ML classifier labels as At-Risk are counted.</w:t>
+      </w:r>
+    </w:p>
+    <w:p>
+      <w:pPr>
+        <w:pStyle w:val="ListBullet"/>
+        <w:spacing w:after="80"/>
+        <w:ind w:left="360"/>
+      </w:pPr>
+      <w:r>
+        <w:rPr>
+          <w:sz w:val="22"/>
+        </w:rPr>
+        <w:t>Yellow line (right axis): Cumulative % of total at-risk value as SKUs are added. This is the Pareto curve.</w:t>
+      </w:r>
+    </w:p>
+    <w:p>
+      <w:pPr>
+        <w:pStyle w:val="ListBullet"/>
+        <w:spacing w:after="80"/>
+        <w:ind w:left="360"/>
+      </w:pPr>
+      <w:r>
+        <w:rPr>
+          <w:sz w:val="22"/>
+        </w:rPr>
+        <w:t>Green dashed line: The 80% concentration threshold — SKUs to the left of where the yellow line crosses this are the top 20% driving 80% of the risk.</w:t>
+      </w:r>
+    </w:p>
+    <w:p/>
+    <w:p>
+      <w:pPr>
+        <w:pStyle w:val="Heading2"/>
+        <w:jc w:val="left"/>
+      </w:pPr>
+      <w:r>
+        <w:rPr>
+          <w:b/>
+          <w:color w:val="1F3864"/>
+        </w:rPr>
+        <w:t>7.2 Why This Matters More Than a Full-Portfolio View</w:t>
+      </w:r>
+    </w:p>
+    <w:p>
+      <w:pPr>
+        <w:spacing w:after="160" w:line="360" w:lineRule="auto"/>
+      </w:pPr>
+      <w:r>
+        <w:rPr>
+          <w:b w:val="0"/>
+          <w:i w:val="0"/>
+          <w:sz w:val="22"/>
+        </w:rPr>
+        <w:t>A full-portfolio intervention (e.g., apply discounts to everything) is operationally expensive and financially inefficient. The Pareto chart answers the question every supply chain director asks: 'Where do I focus first?' If 3 SKUs drive 80% of the write-off risk, the team can focus 100% of its intervention capacity on those 3 products and recover the vast majority of at-risk capital.</w:t>
+      </w:r>
+    </w:p>
+    <w:tbl>
+      <w:tblPr>
+        <w:tblStyle w:val="TableGrid"/>
+        <w:tblW w:type="auto" w:w="0"/>
+        <w:tblLook w:firstColumn="1" w:firstRow="1" w:lastColumn="0" w:lastRow="0" w:noHBand="0" w:noVBand="1" w:val="04A0"/>
+      </w:tblPr>
+      <w:tblGrid>
+        <w:gridCol w:w="9406"/>
+      </w:tblGrid>
+      <w:tr>
+        <w:tc>
+          <w:tcPr>
+            <w:tcW w:type="dxa" w:w="9406"/>
+            <w:shd w:val="clear" w:color="auto" w:fill="F5F3FF"/>
+          </w:tcPr>
+          <w:p>
+            <w:r>
+              <w:rPr>
+                <w:b/>
+                <w:color w:val="EF4444"/>
+                <w:sz w:val="22"/>
+              </w:rPr>
+              <w:t xml:space="preserve">  Pareto Finding Interpretation:</w:t>
+            </w:r>
+          </w:p>
+          <w:p>
+            <w:r>
+              <w:rPr>
+                <w:color w:val="334155"/>
+                <w:sz w:val="21"/>
+              </w:rPr>
+              <w:t xml:space="preserve">  A typical finding is: 'The top N SKU(s) account for 80%+ of all at-risk inventory value.' This means the team can prioritise those N products for accelerated dispatch, velocity programs, or secondary market liquidation and deliver maximum capital recovery per management action — without touching the remaining 80% of the SKU catalogue.</w:t>
+            </w:r>
+          </w:p>
+        </w:tc>
+      </w:tr>
+    </w:tbl>
+    <w:p/>
+    <w:p>
+      <w:pPr>
+        <w:pStyle w:val="Heading2"/>
+        <w:jc w:val="left"/>
+      </w:pPr>
+      <w:r>
+        <w:rPr>
+          <w:b/>
+          <w:color w:val="1F3864"/>
+        </w:rPr>
+        <w:t>7.3 How to Act on the Pareto Finding</w:t>
+      </w:r>
+    </w:p>
+    <w:p>
+      <w:pPr>
+        <w:pStyle w:val="ListBullet"/>
+        <w:spacing w:after="80"/>
+        <w:ind w:left="360"/>
+      </w:pPr>
+      <w:r>
+        <w:rPr>
+          <w:b/>
+          <w:sz w:val="22"/>
+        </w:rPr>
+        <w:t xml:space="preserve">Top 1-3 SKUs (&gt;50% of risk): </w:t>
+      </w:r>
+      <w:r>
+        <w:rPr>
+          <w:sz w:val="22"/>
+        </w:rPr>
+        <w:t xml:space="preserve"> Treat as emergency. Convene a cross-functional war room: Sales Director, Supply Chain VP, and Finance. Assign a dedicated SKU owner responsible for clearing each batch within 30 days.</w:t>
+      </w:r>
+    </w:p>
+    <w:p>
+      <w:pPr>
+        <w:pStyle w:val="ListBullet"/>
+        <w:spacing w:after="80"/>
+        <w:ind w:left="360"/>
+      </w:pPr>
+      <w:r>
+        <w:rPr>
+          <w:b/>
+          <w:sz w:val="22"/>
+        </w:rPr>
+        <w:t xml:space="preserve">SKUs 4-10 (up to 80% of risk): </w:t>
+      </w:r>
+      <w:r>
+        <w:rPr>
+          <w:sz w:val="22"/>
+        </w:rPr>
+        <w:t xml:space="preserve"> Assign to regional sales managers as a velocity sprint target. Set a 14-day review cadence. Consider bundle pricing with faster-moving SKUs to pull demand forward.</w:t>
+      </w:r>
+    </w:p>
+    <w:p>
+      <w:pPr>
+        <w:pStyle w:val="ListBullet"/>
+        <w:spacing w:after="80"/>
+        <w:ind w:left="360"/>
+      </w:pPr>
+      <w:r>
+        <w:rPr>
+          <w:b/>
+          <w:sz w:val="22"/>
+        </w:rPr>
+        <w:t xml:space="preserve">Remaining SKUs (long tail): </w:t>
+      </w:r>
+      <w:r>
+        <w:rPr>
+          <w:sz w:val="22"/>
+        </w:rPr>
+        <w:t xml:space="preserve"> Monitor under standard FEFO. No special intervention needed unless they move into a higher risk band. Re-run Pareto monthly to detect any rising SKUs.</w:t>
+      </w:r>
+    </w:p>
+    <w:p/>
+    <w:p>
+      <w:r>
+        <w:br w:type="page"/>
+      </w:r>
+    </w:p>
+    <w:p>
+      <w:pPr>
+        <w:pStyle w:val="Heading1"/>
+        <w:jc w:val="left"/>
+      </w:pPr>
+      <w:r>
+        <w:rPr>
+          <w:b/>
+          <w:color w:val="1F3864"/>
+        </w:rPr>
+        <w:t>8. Warehouse Risk Concentration — Which DCs Carry the Most Risk?</w:t>
+      </w:r>
+    </w:p>
+    <w:p>
+      <w:pPr>
+        <w:spacing w:after="160" w:line="360" w:lineRule="auto"/>
+      </w:pPr>
+      <w:r>
+        <w:rPr>
+          <w:b w:val="0"/>
+          <w:i w:val="0"/>
+          <w:sz w:val="22"/>
+        </w:rPr>
+        <w:t>Knowing WHAT is at risk (Pareto) is only half the answer. Knowing WHERE it is stored is equally critical — because the intervention (inter-warehouse transfer) is inherently location-specific. The Warehouse Risk Concentration chart identifies which distribution centers (DCs) carry the highest concentration of at-risk inventory, enabling targeted transfer to higher-velocity nodes.</w:t>
+      </w:r>
+    </w:p>
+    <w:p>
+      <w:pPr>
+        <w:pStyle w:val="Heading2"/>
+        <w:jc w:val="left"/>
+      </w:pPr>
+      <w:r>
+        <w:rPr>
+          <w:b/>
+          <w:color w:val="1F3864"/>
+        </w:rPr>
+        <w:t>8.1 What the Chart Shows</w:t>
+      </w:r>
+    </w:p>
+    <w:p>
+      <w:pPr>
+        <w:spacing w:after="120" w:line="360" w:lineRule="auto"/>
+      </w:pPr>
+      <w:r>
+        <w:rPr>
+          <w:b w:val="0"/>
+          <w:i w:val="0"/>
+          <w:sz w:val="22"/>
+        </w:rPr>
+        <w:t>A stacked bar chart shows each warehouse on the X-axis. For each DC, the bar has two stacked components:</w:t>
+      </w:r>
+    </w:p>
+    <w:p>
+      <w:pPr>
+        <w:pStyle w:val="ListBullet"/>
+        <w:spacing w:after="80"/>
+        <w:ind w:left="360"/>
+      </w:pPr>
+      <w:r>
+        <w:rPr>
+          <w:sz w:val="22"/>
+        </w:rPr>
+        <w:t>Red portion (bottom): At-Risk inventory value — batches the ML classifier predicts will expire before selling.</w:t>
+      </w:r>
+    </w:p>
+    <w:p>
+      <w:pPr>
+        <w:pStyle w:val="ListBullet"/>
+        <w:spacing w:after="80"/>
+        <w:ind w:left="360"/>
+      </w:pPr>
+      <w:r>
+        <w:rPr>
+          <w:sz w:val="22"/>
+        </w:rPr>
+        <w:t>Green portion (top): Safe inventory value — batches on track to sell in time.</w:t>
+      </w:r>
+    </w:p>
+    <w:p>
+      <w:pPr>
+        <w:spacing w:after="160" w:line="360" w:lineRule="auto"/>
+      </w:pPr>
+      <w:r>
+        <w:rPr>
+          <w:b w:val="0"/>
+          <w:i/>
+          <w:color w:val="475569"/>
+          <w:sz w:val="20"/>
+        </w:rPr>
+        <w:t>Warehouses are sorted from highest to lowest at-risk value, making the most critical DC immediately visible.</w:t>
+      </w:r>
+    </w:p>
+    <w:p>
+      <w:pPr>
+        <w:pStyle w:val="Heading2"/>
+        <w:jc w:val="left"/>
+      </w:pPr>
+      <w:r>
+        <w:rPr>
+          <w:b/>
+          <w:color w:val="1F3864"/>
+        </w:rPr>
+        <w:t>8.2 Why Warehouse-Level Granularity Is Critical</w:t>
+      </w:r>
+    </w:p>
+    <w:p>
+      <w:pPr>
+        <w:spacing w:after="120" w:line="360" w:lineRule="auto"/>
+      </w:pPr>
+      <w:r>
+        <w:rPr>
+          <w:b w:val="0"/>
+          <w:i w:val="0"/>
+          <w:sz w:val="22"/>
+        </w:rPr>
+        <w:t>The same SKU can be at risk in one warehouse and perfectly safe in another, for three reasons:</w:t>
+      </w:r>
+    </w:p>
+    <w:p>
+      <w:pPr>
+        <w:pStyle w:val="ListBullet"/>
+        <w:spacing w:after="80"/>
+        <w:ind w:left="360"/>
+      </w:pPr>
+      <w:r>
+        <w:rPr>
+          <w:b/>
+          <w:sz w:val="22"/>
+        </w:rPr>
+        <w:t xml:space="preserve">Velocity mismatch: </w:t>
+      </w:r>
+      <w:r>
+        <w:rPr>
+          <w:sz w:val="22"/>
+        </w:rPr>
+        <w:t xml:space="preserve"> A DC serving a rural or low-population catchment area will have slower dispatch velocity for the same SKU than an urban hub. Stock sitting in the low-velocity DC will expire; the same stock transferred to the urban hub would sell through.</w:t>
+      </w:r>
+    </w:p>
+    <w:p>
+      <w:pPr>
+        <w:pStyle w:val="ListBullet"/>
+        <w:spacing w:after="80"/>
+        <w:ind w:left="360"/>
+      </w:pPr>
+      <w:r>
+        <w:rPr>
+          <w:b/>
+          <w:sz w:val="22"/>
+        </w:rPr>
+        <w:t xml:space="preserve">Channel composition: </w:t>
+      </w:r>
+      <w:r>
+        <w:rPr>
+          <w:sz w:val="22"/>
+        </w:rPr>
+        <w:t xml:space="preserve"> Some DCs serve hospital direct channels (fast, bulk, predictable demand). Others serve retail pharmacy channels (slower, fragmented, seasonal). The same batch has very different expiry risk depending on which channel the DC serves.</w:t>
+      </w:r>
+    </w:p>
+    <w:p>
+      <w:pPr>
+        <w:pStyle w:val="ListBullet"/>
+        <w:spacing w:after="80"/>
+        <w:ind w:left="360"/>
+      </w:pPr>
+      <w:r>
+        <w:rPr>
+          <w:b/>
+          <w:sz w:val="22"/>
+        </w:rPr>
+        <w:t xml:space="preserve">Cold-chain capability: </w:t>
+      </w:r>
+      <w:r>
+        <w:rPr>
+          <w:sz w:val="22"/>
+        </w:rPr>
+        <w:t xml:space="preserve"> A batch requiring refrigeration stored in a DC without adequate cold-chain capacity is at immediate regulatory risk — independently of its demand velocity.</w:t>
+      </w:r>
+    </w:p>
+    <w:p/>
+    <w:p>
+      <w:pPr>
+        <w:pStyle w:val="Heading2"/>
+        <w:jc w:val="left"/>
+      </w:pPr>
+      <w:r>
+        <w:rPr>
+          <w:b/>
+          <w:color w:val="1F3864"/>
+        </w:rPr>
+        <w:t>8.3 The Inter-Warehouse Transfer Decision</w:t>
+      </w:r>
+    </w:p>
+    <w:p>
+      <w:pPr>
+        <w:spacing w:after="160" w:line="360" w:lineRule="auto"/>
+      </w:pPr>
+      <w:r>
+        <w:rPr>
+          <w:b w:val="0"/>
+          <w:i w:val="0"/>
+          <w:sz w:val="22"/>
+        </w:rPr>
+        <w:t>When the warehouse risk chart identifies a high-risk DC, the prescriptive action is inter-warehouse transfer. This is not a simple reallocation — it has a logistics cost that must be weighed against the value at risk:</w:t>
+      </w:r>
+    </w:p>
+    <w:tbl>
+      <w:tblPr>
+        <w:tblStyle w:val="TableGrid"/>
+        <w:tblW w:type="auto" w:w="0"/>
+        <w:tblLook w:firstColumn="1" w:firstRow="1" w:lastColumn="0" w:lastRow="0" w:noHBand="0" w:noVBand="1" w:val="04A0"/>
+      </w:tblPr>
+      <w:tblGrid>
+        <w:gridCol w:w="2351"/>
+        <w:gridCol w:w="2351"/>
+        <w:gridCol w:w="2351"/>
+        <w:gridCol w:w="2351"/>
+      </w:tblGrid>
+      <w:tr>
+        <w:tc>
+          <w:tcPr>
+            <w:tcW w:type="dxa" w:w="2351"/>
+            <w:shd w:val="clear" w:color="auto" w:fill="1F3864"/>
+          </w:tcPr>
+          <w:p>
+            <w:r>
+              <w:rPr>
+                <w:b/>
+                <w:color w:val="FFFFFF"/>
+                <w:sz w:val="20"/>
+              </w:rPr>
+              <w:t>Condition</w:t>
+            </w:r>
+          </w:p>
+        </w:tc>
+        <w:tc>
+          <w:tcPr>
+            <w:tcW w:type="dxa" w:w="2351"/>
+            <w:shd w:val="clear" w:color="auto" w:fill="1F3864"/>
+          </w:tcPr>
+          <w:p>
+            <w:r>
+              <w:rPr>
+                <w:b/>
+                <w:color w:val="FFFFFF"/>
+                <w:sz w:val="20"/>
+              </w:rPr>
+              <w:t>Transfer Decision</w:t>
+            </w:r>
+          </w:p>
+        </w:tc>
+        <w:tc>
+          <w:tcPr>
+            <w:tcW w:type="dxa" w:w="2351"/>
+            <w:shd w:val="clear" w:color="auto" w:fill="1F3864"/>
+          </w:tcPr>
+          <w:p>
+            <w:r>
+              <w:rPr>
+                <w:b/>
+                <w:color w:val="FFFFFF"/>
+                <w:sz w:val="20"/>
+              </w:rPr>
+              <w:t>Cost Threshold</w:t>
+            </w:r>
+          </w:p>
+        </w:tc>
+        <w:tc>
+          <w:tcPr>
+            <w:tcW w:type="dxa" w:w="2351"/>
+            <w:shd w:val="clear" w:color="auto" w:fill="1F3864"/>
+          </w:tcPr>
+          <w:p>
+            <w:r>
+              <w:rPr>
+                <w:b/>
+                <w:color w:val="FFFFFF"/>
+                <w:sz w:val="20"/>
+              </w:rPr>
+              <w:t>Expected Recovery</w:t>
+            </w:r>
+          </w:p>
+        </w:tc>
+      </w:tr>
+      <w:tr>
+        <w:tc>
+          <w:tcPr>
+            <w:tcW w:type="dxa" w:w="2351"/>
+            <w:vAlign w:val="center"/>
+          </w:tcPr>
+          <w:p>
+            <w:r>
+              <w:rPr>
+                <w:b w:val="0"/>
+                <w:sz w:val="19"/>
+              </w:rPr>
+              <w:t>DTE &gt; 90 days, high-velocity DC available</w:t>
+            </w:r>
+          </w:p>
+        </w:tc>
+        <w:tc>
+          <w:tcPr>
+            <w:tcW w:type="dxa" w:w="2351"/>
+            <w:vAlign w:val="center"/>
+          </w:tcPr>
+          <w:p>
+            <w:r>
+              <w:rPr>
+                <w:b w:val="0"/>
+                <w:sz w:val="19"/>
+              </w:rPr>
+              <w:t>TRANSFER — highest priority</w:t>
+            </w:r>
+          </w:p>
+        </w:tc>
+        <w:tc>
+          <w:tcPr>
+            <w:tcW w:type="dxa" w:w="2351"/>
+            <w:vAlign w:val="center"/>
+          </w:tcPr>
+          <w:p>
+            <w:r>
+              <w:rPr>
+                <w:b w:val="0"/>
+                <w:sz w:val="19"/>
+              </w:rPr>
+              <w:t>Freight cost &lt; 15% of batch value</w:t>
+            </w:r>
+          </w:p>
+        </w:tc>
+        <w:tc>
+          <w:tcPr>
+            <w:tcW w:type="dxa" w:w="2351"/>
+            <w:vAlign w:val="center"/>
+          </w:tcPr>
+          <w:p>
+            <w:r>
+              <w:rPr>
+                <w:b w:val="0"/>
+                <w:sz w:val="19"/>
+              </w:rPr>
+              <w:t>90-100% value recovery via normal dispatch at destination</w:t>
+            </w:r>
+          </w:p>
+        </w:tc>
+      </w:tr>
+      <w:tr>
+        <w:tc>
+          <w:tcPr>
+            <w:tcW w:type="dxa" w:w="2351"/>
+            <w:vAlign w:val="center"/>
+          </w:tcPr>
+          <w:p>
+            <w:r>
+              <w:rPr>
+                <w:b w:val="0"/>
+                <w:sz w:val="19"/>
+              </w:rPr>
+              <w:t>DTE 30-90 days, moderate velocity DC</w:t>
+            </w:r>
+          </w:p>
+        </w:tc>
+        <w:tc>
+          <w:tcPr>
+            <w:tcW w:type="dxa" w:w="2351"/>
+            <w:vAlign w:val="center"/>
+          </w:tcPr>
+          <w:p>
+            <w:r>
+              <w:rPr>
+                <w:b w:val="0"/>
+                <w:sz w:val="19"/>
+              </w:rPr>
+              <w:t>TRANSFER + discounted pricing</w:t>
+            </w:r>
+          </w:p>
+        </w:tc>
+        <w:tc>
+          <w:tcPr>
+            <w:tcW w:type="dxa" w:w="2351"/>
+            <w:vAlign w:val="center"/>
+          </w:tcPr>
+          <w:p>
+            <w:r>
+              <w:rPr>
+                <w:b w:val="0"/>
+                <w:sz w:val="19"/>
+              </w:rPr>
+              <w:t>Freight cost &lt; 25% of batch value</w:t>
+            </w:r>
+          </w:p>
+        </w:tc>
+        <w:tc>
+          <w:tcPr>
+            <w:tcW w:type="dxa" w:w="2351"/>
+            <w:vAlign w:val="center"/>
+          </w:tcPr>
+          <w:p>
+            <w:r>
+              <w:rPr>
+                <w:b w:val="0"/>
+                <w:sz w:val="19"/>
+              </w:rPr>
+              <w:t>70-85% value recovery with discount to accelerate clearance</w:t>
+            </w:r>
+          </w:p>
+        </w:tc>
+      </w:tr>
+      <w:tr>
+        <w:tc>
+          <w:tcPr>
+            <w:tcW w:type="dxa" w:w="2351"/>
+            <w:vAlign w:val="center"/>
+          </w:tcPr>
+          <w:p>
+            <w:r>
+              <w:rPr>
+                <w:b w:val="0"/>
+                <w:sz w:val="19"/>
+              </w:rPr>
+              <w:t>DTE &lt; 30 days, any DC</w:t>
+            </w:r>
+          </w:p>
+        </w:tc>
+        <w:tc>
+          <w:tcPr>
+            <w:tcW w:type="dxa" w:w="2351"/>
+            <w:vAlign w:val="center"/>
+          </w:tcPr>
+          <w:p>
+            <w:r>
+              <w:rPr>
+                <w:b w:val="0"/>
+                <w:sz w:val="19"/>
+              </w:rPr>
+              <w:t>Liquidation preferred over transfer</w:t>
+            </w:r>
+          </w:p>
+        </w:tc>
+        <w:tc>
+          <w:tcPr>
+            <w:tcW w:type="dxa" w:w="2351"/>
+            <w:vAlign w:val="center"/>
+          </w:tcPr>
+          <w:p>
+            <w:r>
+              <w:rPr>
+                <w:b w:val="0"/>
+                <w:sz w:val="19"/>
+              </w:rPr>
+              <w:t>Transfer cost likely exceeds recovery benefit</w:t>
+            </w:r>
+          </w:p>
+        </w:tc>
+        <w:tc>
+          <w:tcPr>
+            <w:tcW w:type="dxa" w:w="2351"/>
+            <w:vAlign w:val="center"/>
+          </w:tcPr>
+          <w:p>
+            <w:r>
+              <w:rPr>
+                <w:b w:val="0"/>
+                <w:sz w:val="19"/>
+              </w:rPr>
+              <w:t>40-60% via secondary market liquidator</w:t>
+            </w:r>
+          </w:p>
+        </w:tc>
+      </w:tr>
+      <w:tr>
+        <w:tc>
+          <w:tcPr>
+            <w:tcW w:type="dxa" w:w="2351"/>
+            <w:vAlign w:val="center"/>
+          </w:tcPr>
+          <w:p>
+            <w:r>
+              <w:rPr>
+                <w:b w:val="0"/>
+                <w:sz w:val="19"/>
+              </w:rPr>
+              <w:t>DTE &lt;= 0 (expired)</w:t>
+            </w:r>
+          </w:p>
+        </w:tc>
+        <w:tc>
+          <w:tcPr>
+            <w:tcW w:type="dxa" w:w="2351"/>
+            <w:vAlign w:val="center"/>
+          </w:tcPr>
+          <w:p>
+            <w:r>
+              <w:rPr>
+                <w:b w:val="0"/>
+                <w:sz w:val="19"/>
+              </w:rPr>
+              <w:t>NO transfer — certified destruction only</w:t>
+            </w:r>
+          </w:p>
+        </w:tc>
+        <w:tc>
+          <w:tcPr>
+            <w:tcW w:type="dxa" w:w="2351"/>
+            <w:vAlign w:val="center"/>
+          </w:tcPr>
+          <w:p>
+            <w:r>
+              <w:rPr>
+                <w:b w:val="0"/>
+                <w:sz w:val="19"/>
+              </w:rPr>
+              <w:t>N/A</w:t>
+            </w:r>
+          </w:p>
+        </w:tc>
+        <w:tc>
+          <w:tcPr>
+            <w:tcW w:type="dxa" w:w="2351"/>
+            <w:vAlign w:val="center"/>
+          </w:tcPr>
+          <w:p>
+            <w:r>
+              <w:rPr>
+                <w:b w:val="0"/>
+                <w:sz w:val="19"/>
+              </w:rPr>
+              <w:t>0% — write-off with regulatory documentation</w:t>
+            </w:r>
+          </w:p>
+        </w:tc>
+      </w:tr>
+    </w:tbl>
+    <w:p/>
+    <w:p>
+      <w:r>
+        <w:br w:type="page"/>
+      </w:r>
+    </w:p>
+    <w:p>
+      <w:pPr>
+        <w:pStyle w:val="Heading1"/>
+        <w:jc w:val="left"/>
+      </w:pPr>
+      <w:r>
+        <w:rPr>
+          <w:b/>
+          <w:color w:val="1F3864"/>
+        </w:rPr>
+        <w:t>9. Explainable AI (XAI) — Making the Model Auditable and Trustworthy</w:t>
+      </w:r>
+    </w:p>
+    <w:p>
+      <w:pPr>
+        <w:spacing w:after="160" w:line="360" w:lineRule="auto"/>
+      </w:pPr>
+      <w:r>
+        <w:rPr>
+          <w:b w:val="0"/>
+          <w:i w:val="0"/>
+          <w:sz w:val="22"/>
+        </w:rPr>
+        <w:t>A machine learning model that produces a prediction without explanation is a black box — and black boxes are unacceptable in pharmaceutical supply chain management, where regulatory auditors, quality directors, and C-suite executives must be able to understand, challenge, and trust every decision. PharmaTrace embeds Explainable AI (XAI) throughout the classifier to ensure every risk prediction is traceable, interpretable, and auditable.</w:t>
+      </w:r>
+    </w:p>
+    <w:p>
+      <w:pPr>
+        <w:pStyle w:val="Heading2"/>
+        <w:jc w:val="left"/>
+      </w:pPr>
+      <w:r>
+        <w:rPr>
+          <w:b/>
+          <w:color w:val="1F3864"/>
+        </w:rPr>
+        <w:t>9.1 What Explainability Means in This Context</w:t>
+      </w:r>
+    </w:p>
+    <w:p>
+      <w:pPr>
+        <w:spacing w:after="120" w:line="360" w:lineRule="auto"/>
+      </w:pPr>
+      <w:r>
+        <w:rPr>
+          <w:b w:val="0"/>
+          <w:i w:val="0"/>
+          <w:sz w:val="22"/>
+        </w:rPr>
+        <w:t>XAI in PharmaTrace operates at three levels:</w:t>
+      </w:r>
+    </w:p>
+    <w:p>
+      <w:pPr>
+        <w:pStyle w:val="ListBullet"/>
+        <w:spacing w:after="80"/>
+        <w:ind w:left="360"/>
+      </w:pPr>
+      <w:r>
+        <w:rPr>
+          <w:b/>
+          <w:sz w:val="22"/>
+        </w:rPr>
+        <w:t xml:space="preserve">Global Explainability (Feature Importance): </w:t>
+      </w:r>
+      <w:r>
+        <w:rPr>
+          <w:sz w:val="22"/>
+        </w:rPr>
+        <w:t xml:space="preserve"> Answers: 'What variables does the model rely on most across ALL batches?' The feature importance chart (Section 6) is a global explanation — it shows that Velocity Pressure and Cover Days drive most predictions. This is auditable at the board level: 'Our model prioritises operational velocity metrics over price signals, because velocity is the direct driver of clearance time.'</w:t>
+      </w:r>
+    </w:p>
+    <w:p>
+      <w:pPr>
+        <w:pStyle w:val="ListBullet"/>
+        <w:spacing w:after="80"/>
+        <w:ind w:left="360"/>
+      </w:pPr>
+      <w:r>
+        <w:rPr>
+          <w:b/>
+          <w:sz w:val="22"/>
+        </w:rPr>
+        <w:t xml:space="preserve">Local Explainability (Per-Batch Probability Score): </w:t>
+      </w:r>
+      <w:r>
+        <w:rPr>
+          <w:sz w:val="22"/>
+        </w:rPr>
+        <w:t xml:space="preserve"> Answers: 'Why did this specific batch get flagged?' The probability score (0-100%) from predict_proba() is a local explanation at the batch level. A score of 87% means the model's feature combination for this batch is highly similar to batches that historically expired. A warehouse manager can see: 'Batch XYZ has VP = 2.3, Cover Days = 180, DTE = 78 — that's why the score is 87%.'</w:t>
+      </w:r>
+    </w:p>
+    <w:p>
+      <w:pPr>
+        <w:pStyle w:val="ListBullet"/>
+        <w:spacing w:after="80"/>
+        <w:ind w:left="360"/>
+      </w:pPr>
+      <w:r>
+        <w:rPr>
+          <w:b/>
+          <w:sz w:val="22"/>
+        </w:rPr>
+        <w:t xml:space="preserve">Prescriptive Explainability (Recovery Zone Assignment): </w:t>
+      </w:r>
+      <w:r>
+        <w:rPr>
+          <w:sz w:val="22"/>
+        </w:rPr>
+        <w:t xml:space="preserve"> Answers: 'What should be done, and why?' The Prescriptive Recovery Playbook (Section 12) translates each model output into a specific, justified action with a quantified expected recovery rate. This is the most operationally valuable form of explainability.</w:t>
+      </w:r>
+    </w:p>
+    <w:p/>
+    <w:p>
+      <w:pPr>
+        <w:pStyle w:val="Heading2"/>
+        <w:jc w:val="left"/>
+      </w:pPr>
+      <w:r>
+        <w:rPr>
+          <w:b/>
+          <w:color w:val="1F3864"/>
+        </w:rPr>
+        <w:t>9.2 The Prescriptive Recovery Playbook — XAI in Action</w:t>
+      </w:r>
+    </w:p>
+    <w:p>
+      <w:pPr>
+        <w:spacing w:after="160" w:line="360" w:lineRule="auto"/>
+      </w:pPr>
+      <w:r>
+        <w:rPr>
+          <w:b w:val="0"/>
+          <w:i w:val="0"/>
+          <w:sz w:val="22"/>
+        </w:rPr>
+        <w:t>The Prescriptive Recovery Playbook is the bridge between the classifier's output and management action. It takes every batch, assigns it to a recovery zone based on DTE and velocity pressure, and attaches a quantified expected recovery rate to each zone:</w:t>
+      </w:r>
+    </w:p>
+    <w:tbl>
+      <w:tblPr>
+        <w:tblStyle w:val="TableGrid"/>
+        <w:tblW w:type="auto" w:w="0"/>
+        <w:tblLook w:firstColumn="1" w:firstRow="1" w:lastColumn="0" w:lastRow="0" w:noHBand="0" w:noVBand="1" w:val="04A0"/>
+      </w:tblPr>
+      <w:tblGrid>
+        <w:gridCol w:w="1881"/>
+        <w:gridCol w:w="1881"/>
+        <w:gridCol w:w="1881"/>
+        <w:gridCol w:w="1881"/>
+        <w:gridCol w:w="1881"/>
+      </w:tblGrid>
+      <w:tr>
+        <w:tc>
+          <w:tcPr>
+            <w:tcW w:type="dxa" w:w="1881"/>
+            <w:shd w:val="clear" w:color="auto" w:fill="1F3864"/>
+          </w:tcPr>
+          <w:p>
+            <w:r>
+              <w:rPr>
+                <w:b/>
+                <w:color w:val="FFFFFF"/>
+                <w:sz w:val="20"/>
+              </w:rPr>
+              <w:t>Zone</w:t>
+            </w:r>
+          </w:p>
+        </w:tc>
+        <w:tc>
+          <w:tcPr>
+            <w:tcW w:type="dxa" w:w="1881"/>
+            <w:shd w:val="clear" w:color="auto" w:fill="1F3864"/>
+          </w:tcPr>
+          <w:p>
+            <w:r>
+              <w:rPr>
+                <w:b/>
+                <w:color w:val="FFFFFF"/>
+                <w:sz w:val="20"/>
+              </w:rPr>
+              <w:t>DTE Condition</w:t>
+            </w:r>
+          </w:p>
+        </w:tc>
+        <w:tc>
+          <w:tcPr>
+            <w:tcW w:type="dxa" w:w="1881"/>
+            <w:shd w:val="clear" w:color="auto" w:fill="1F3864"/>
+          </w:tcPr>
+          <w:p>
+            <w:r>
+              <w:rPr>
+                <w:b/>
+                <w:color w:val="FFFFFF"/>
+                <w:sz w:val="20"/>
+              </w:rPr>
+              <w:t>Additional Trigger</w:t>
+            </w:r>
+          </w:p>
+        </w:tc>
+        <w:tc>
+          <w:tcPr>
+            <w:tcW w:type="dxa" w:w="1881"/>
+            <w:shd w:val="clear" w:color="auto" w:fill="1F3864"/>
+          </w:tcPr>
+          <w:p>
+            <w:r>
+              <w:rPr>
+                <w:b/>
+                <w:color w:val="FFFFFF"/>
+                <w:sz w:val="20"/>
+              </w:rPr>
+              <w:t>Recovery Rate</w:t>
+            </w:r>
+          </w:p>
+        </w:tc>
+        <w:tc>
+          <w:tcPr>
+            <w:tcW w:type="dxa" w:w="1881"/>
+            <w:shd w:val="clear" w:color="auto" w:fill="1F3864"/>
+          </w:tcPr>
+          <w:p>
+            <w:r>
+              <w:rPr>
+                <w:b/>
+                <w:color w:val="FFFFFF"/>
+                <w:sz w:val="20"/>
+              </w:rPr>
+              <w:t>Rationale</w:t>
+            </w:r>
+          </w:p>
+        </w:tc>
+      </w:tr>
+      <w:tr>
+        <w:tc>
+          <w:tcPr>
+            <w:tcW w:type="dxa" w:w="1881"/>
+            <w:vAlign w:val="center"/>
+          </w:tcPr>
+          <w:p>
+            <w:r>
+              <w:rPr>
+                <w:b w:val="0"/>
+                <w:sz w:val="19"/>
+              </w:rPr>
+              <w:t>Expired (Write-Off)</w:t>
+            </w:r>
+          </w:p>
+        </w:tc>
+        <w:tc>
+          <w:tcPr>
+            <w:tcW w:type="dxa" w:w="1881"/>
+            <w:vAlign w:val="center"/>
+          </w:tcPr>
+          <w:p>
+            <w:r>
+              <w:rPr>
+                <w:b w:val="0"/>
+                <w:sz w:val="19"/>
+              </w:rPr>
+              <w:t>DTE &lt;= 0</w:t>
+            </w:r>
+          </w:p>
+        </w:tc>
+        <w:tc>
+          <w:tcPr>
+            <w:tcW w:type="dxa" w:w="1881"/>
+            <w:vAlign w:val="center"/>
+          </w:tcPr>
+          <w:p>
+            <w:r>
+              <w:rPr>
+                <w:b w:val="0"/>
+                <w:sz w:val="19"/>
+              </w:rPr>
+              <w:t>None — already expired</w:t>
+            </w:r>
+          </w:p>
+        </w:tc>
+        <w:tc>
+          <w:tcPr>
+            <w:tcW w:type="dxa" w:w="1881"/>
+            <w:vAlign w:val="center"/>
+          </w:tcPr>
+          <w:p>
+            <w:r>
+              <w:rPr>
+                <w:b w:val="0"/>
+                <w:sz w:val="19"/>
+              </w:rPr>
+              <w:t>0% recovery</w:t>
+            </w:r>
+          </w:p>
+        </w:tc>
+        <w:tc>
+          <w:tcPr>
+            <w:tcW w:type="dxa" w:w="1881"/>
+            <w:vAlign w:val="center"/>
+          </w:tcPr>
+          <w:p>
+            <w:r>
+              <w:rPr>
+                <w:b w:val="0"/>
+                <w:sz w:val="19"/>
+              </w:rPr>
+              <w:t>No commercial recovery possible. Certified destruction under FDA/CDSCO mandate. Cost = disposal + regulatory documentation.</w:t>
+            </w:r>
+          </w:p>
+        </w:tc>
+      </w:tr>
+      <w:tr>
+        <w:tc>
+          <w:tcPr>
+            <w:tcW w:type="dxa" w:w="1881"/>
+            <w:vAlign w:val="center"/>
+          </w:tcPr>
+          <w:p>
+            <w:r>
+              <w:rPr>
+                <w:b w:val="0"/>
+                <w:sz w:val="19"/>
+              </w:rPr>
+              <w:t>Critical (&lt;90 days)</w:t>
+            </w:r>
+          </w:p>
+        </w:tc>
+        <w:tc>
+          <w:tcPr>
+            <w:tcW w:type="dxa" w:w="1881"/>
+            <w:vAlign w:val="center"/>
+          </w:tcPr>
+          <w:p>
+            <w:r>
+              <w:rPr>
+                <w:b w:val="0"/>
+                <w:sz w:val="19"/>
+              </w:rPr>
+              <w:t>DTE &lt;= 90 days</w:t>
+            </w:r>
+          </w:p>
+        </w:tc>
+        <w:tc>
+          <w:tcPr>
+            <w:tcW w:type="dxa" w:w="1881"/>
+            <w:vAlign w:val="center"/>
+          </w:tcPr>
+          <w:p>
+            <w:r>
+              <w:rPr>
+                <w:b w:val="0"/>
+                <w:sz w:val="19"/>
+              </w:rPr>
+              <w:t>OR: VP &gt; 1.0 even if DTE &gt; 90</w:t>
+            </w:r>
+          </w:p>
+        </w:tc>
+        <w:tc>
+          <w:tcPr>
+            <w:tcW w:type="dxa" w:w="1881"/>
+            <w:vAlign w:val="center"/>
+          </w:tcPr>
+          <w:p>
+            <w:r>
+              <w:rPr>
+                <w:b w:val="0"/>
+                <w:sz w:val="19"/>
+              </w:rPr>
+              <w:t>55% recovery</w:t>
+            </w:r>
+          </w:p>
+        </w:tc>
+        <w:tc>
+          <w:tcPr>
+            <w:tcW w:type="dxa" w:w="1881"/>
+            <w:vAlign w:val="center"/>
+          </w:tcPr>
+          <w:p>
+            <w:r>
+              <w:rPr>
+                <w:b w:val="0"/>
+                <w:sz w:val="19"/>
+              </w:rPr>
+              <w:t>Liquidation at 40-60% discount to secondary market. Also captures velocity-crisis batches where cover exceeds expiry regardless of DTE.</w:t>
+            </w:r>
+          </w:p>
+        </w:tc>
+      </w:tr>
+      <w:tr>
+        <w:tc>
+          <w:tcPr>
+            <w:tcW w:type="dxa" w:w="1881"/>
+            <w:vAlign w:val="center"/>
+          </w:tcPr>
+          <w:p>
+            <w:r>
+              <w:rPr>
+                <w:b w:val="0"/>
+                <w:sz w:val="19"/>
+              </w:rPr>
+              <w:t>At-Risk (90-180 days)</w:t>
+            </w:r>
+          </w:p>
+        </w:tc>
+        <w:tc>
+          <w:tcPr>
+            <w:tcW w:type="dxa" w:w="1881"/>
+            <w:vAlign w:val="center"/>
+          </w:tcPr>
+          <w:p>
+            <w:r>
+              <w:rPr>
+                <w:b w:val="0"/>
+                <w:sz w:val="19"/>
+              </w:rPr>
+              <w:t>90 &lt; DTE &lt;= 180 days</w:t>
+            </w:r>
+          </w:p>
+        </w:tc>
+        <w:tc>
+          <w:tcPr>
+            <w:tcW w:type="dxa" w:w="1881"/>
+            <w:vAlign w:val="center"/>
+          </w:tcPr>
+          <w:p>
+            <w:r>
+              <w:rPr>
+                <w:b w:val="0"/>
+                <w:sz w:val="19"/>
+              </w:rPr>
+              <w:t>Normal velocity</w:t>
+            </w:r>
+          </w:p>
+        </w:tc>
+        <w:tc>
+          <w:tcPr>
+            <w:tcW w:type="dxa" w:w="1881"/>
+            <w:vAlign w:val="center"/>
+          </w:tcPr>
+          <w:p>
+            <w:r>
+              <w:rPr>
+                <w:b w:val="0"/>
+                <w:sz w:val="19"/>
+              </w:rPr>
+              <w:t>82% recovery</w:t>
+            </w:r>
+          </w:p>
+        </w:tc>
+        <w:tc>
+          <w:tcPr>
+            <w:tcW w:type="dxa" w:w="1881"/>
+            <w:vAlign w:val="center"/>
+          </w:tcPr>
+          <w:p>
+            <w:r>
+              <w:rPr>
+                <w:b w:val="0"/>
+                <w:sz w:val="19"/>
+              </w:rPr>
+              <w:t>Accelerated dispatch via inter-warehouse transfer to higher-velocity DC, or institutional direct sale. 180-day window is sufficient for active intervention.</w:t>
+            </w:r>
+          </w:p>
+        </w:tc>
+      </w:tr>
+      <w:tr>
+        <w:tc>
+          <w:tcPr>
+            <w:tcW w:type="dxa" w:w="1881"/>
+            <w:vAlign w:val="center"/>
+          </w:tcPr>
+          <w:p>
+            <w:r>
+              <w:rPr>
+                <w:b w:val="0"/>
+                <w:sz w:val="19"/>
+              </w:rPr>
+              <w:t>Monitor (180-365 days)</w:t>
+            </w:r>
+          </w:p>
+        </w:tc>
+        <w:tc>
+          <w:tcPr>
+            <w:tcW w:type="dxa" w:w="1881"/>
+            <w:vAlign w:val="center"/>
+          </w:tcPr>
+          <w:p>
+            <w:r>
+              <w:rPr>
+                <w:b w:val="0"/>
+                <w:sz w:val="19"/>
+              </w:rPr>
+              <w:t>180 &lt; DTE &lt;= 365 days</w:t>
+            </w:r>
+          </w:p>
+        </w:tc>
+        <w:tc>
+          <w:tcPr>
+            <w:tcW w:type="dxa" w:w="1881"/>
+            <w:vAlign w:val="center"/>
+          </w:tcPr>
+          <w:p>
+            <w:r>
+              <w:rPr>
+                <w:b w:val="0"/>
+                <w:sz w:val="19"/>
+              </w:rPr>
+              <w:t>Normal velocity</w:t>
+            </w:r>
+          </w:p>
+        </w:tc>
+        <w:tc>
+          <w:tcPr>
+            <w:tcW w:type="dxa" w:w="1881"/>
+            <w:vAlign w:val="center"/>
+          </w:tcPr>
+          <w:p>
+            <w:r>
+              <w:rPr>
+                <w:b w:val="0"/>
+                <w:sz w:val="19"/>
+              </w:rPr>
+              <w:t>96% recovery</w:t>
+            </w:r>
+          </w:p>
+        </w:tc>
+        <w:tc>
+          <w:tcPr>
+            <w:tcW w:type="dxa" w:w="1881"/>
+            <w:vAlign w:val="center"/>
+          </w:tcPr>
+          <w:p>
+            <w:r>
+              <w:rPr>
+                <w:b w:val="0"/>
+                <w:sz w:val="19"/>
+              </w:rPr>
+              <w:t>Standard FEFO with minor channel optimisation. Very high recovery expected with minimal intervention.</w:t>
+            </w:r>
+          </w:p>
+        </w:tc>
+      </w:tr>
+      <w:tr>
+        <w:tc>
+          <w:tcPr>
+            <w:tcW w:type="dxa" w:w="1881"/>
+            <w:vAlign w:val="center"/>
+          </w:tcPr>
+          <w:p>
+            <w:r>
+              <w:rPr>
+                <w:b w:val="0"/>
+                <w:sz w:val="19"/>
+              </w:rPr>
+              <w:t>Safe (&gt;365 days)</w:t>
+            </w:r>
+          </w:p>
+        </w:tc>
+        <w:tc>
+          <w:tcPr>
+            <w:tcW w:type="dxa" w:w="1881"/>
+            <w:vAlign w:val="center"/>
+          </w:tcPr>
+          <w:p>
+            <w:r>
+              <w:rPr>
+                <w:b w:val="0"/>
+                <w:sz w:val="19"/>
+              </w:rPr>
+              <w:t>DTE &gt; 365 days</w:t>
+            </w:r>
+          </w:p>
+        </w:tc>
+        <w:tc>
+          <w:tcPr>
+            <w:tcW w:type="dxa" w:w="1881"/>
+            <w:vAlign w:val="center"/>
+          </w:tcPr>
+          <w:p>
+            <w:r>
+              <w:rPr>
+                <w:b w:val="0"/>
+                <w:sz w:val="19"/>
+              </w:rPr>
+              <w:t>VP &lt; 1.0</w:t>
+            </w:r>
+          </w:p>
+        </w:tc>
+        <w:tc>
+          <w:tcPr>
+            <w:tcW w:type="dxa" w:w="1881"/>
+            <w:vAlign w:val="center"/>
+          </w:tcPr>
+          <w:p>
+            <w:r>
+              <w:rPr>
+                <w:b w:val="0"/>
+                <w:sz w:val="19"/>
+              </w:rPr>
+              <w:t>100% recovery</w:t>
+            </w:r>
+          </w:p>
+        </w:tc>
+        <w:tc>
+          <w:tcPr>
+            <w:tcW w:type="dxa" w:w="1881"/>
+            <w:vAlign w:val="center"/>
+          </w:tcPr>
+          <w:p>
+            <w:r>
+              <w:rPr>
+                <w:b w:val="0"/>
+                <w:sz w:val="19"/>
+              </w:rPr>
+              <w:t>No risk. Maintain standard FEFO. No intervention required.</w:t>
+            </w:r>
+          </w:p>
+        </w:tc>
+      </w:tr>
+    </w:tbl>
+    <w:p/>
+    <w:p>
+      <w:pPr>
+        <w:pStyle w:val="Heading2"/>
+        <w:jc w:val="left"/>
+      </w:pPr>
+      <w:r>
+        <w:rPr>
+          <w:b/>
+          <w:color w:val="1F3864"/>
+        </w:rPr>
+        <w:t>9.3 Portfolio-Level Financial Impact Quantification</w:t>
+      </w:r>
+    </w:p>
+    <w:p>
+      <w:pPr>
+        <w:spacing w:after="120" w:line="360" w:lineRule="auto"/>
+      </w:pPr>
+      <w:r>
+        <w:rPr>
+          <w:b w:val="0"/>
+          <w:i w:val="0"/>
+          <w:sz w:val="22"/>
+        </w:rPr>
+        <w:t>The Prescriptive Recovery Playbook aggregates zone-level recovery rates across the entire portfolio to produce four key management metrics:</w:t>
+      </w:r>
+    </w:p>
+    <w:p>
+      <w:pPr>
+        <w:pStyle w:val="ListBullet"/>
+        <w:spacing w:after="80"/>
+        <w:ind w:left="360"/>
+      </w:pPr>
+      <w:r>
+        <w:rPr>
+          <w:sz w:val="22"/>
+        </w:rPr>
+        <w:t>Total Portfolio Value: The total USD/INR value of all active inventory batches across all warehouses.</w:t>
+      </w:r>
+    </w:p>
+    <w:p>
+      <w:pPr>
+        <w:pStyle w:val="ListBullet"/>
+        <w:spacing w:after="80"/>
+        <w:ind w:left="360"/>
+      </w:pPr>
+      <w:r>
+        <w:rPr>
+          <w:sz w:val="22"/>
+        </w:rPr>
+        <w:t>At-Risk Value: Combined value of Expired + Critical + At-Risk zone batches — the capital under immediate threat.</w:t>
+      </w:r>
+    </w:p>
+    <w:p>
+      <w:pPr>
+        <w:pStyle w:val="ListBullet"/>
+        <w:spacing w:after="80"/>
+        <w:ind w:left="360"/>
+      </w:pPr>
+      <w:r>
+        <w:rPr>
+          <w:sz w:val="22"/>
+        </w:rPr>
+        <w:t>Estimated Write-Off (if NO action taken): The total value lost if management takes no intervention. This is the 'cost of inaction' number for executive reporting.</w:t>
+      </w:r>
+    </w:p>
+    <w:p>
+      <w:pPr>
+        <w:pStyle w:val="ListBullet"/>
+        <w:spacing w:after="80"/>
+        <w:ind w:left="360"/>
+      </w:pPr>
+      <w:r>
+        <w:rPr>
+          <w:sz w:val="22"/>
+        </w:rPr>
+        <w:t>Recoverable Value (with immediate action): The value that CAN be saved if the zone-specific playbook actions are executed immediately. This is the ROI of the ML system.</w:t>
+      </w:r>
+    </w:p>
+    <w:p/>
+    <w:tbl>
+      <w:tblPr>
+        <w:tblStyle w:val="TableGrid"/>
+        <w:tblW w:type="auto" w:w="0"/>
+        <w:tblLook w:firstColumn="1" w:firstRow="1" w:lastColumn="0" w:lastRow="0" w:noHBand="0" w:noVBand="1" w:val="04A0"/>
+      </w:tblPr>
+      <w:tblGrid>
+        <w:gridCol w:w="9406"/>
+      </w:tblGrid>
+      <w:tr>
+        <w:tc>
+          <w:tcPr>
+            <w:tcW w:type="dxa" w:w="9406"/>
+            <w:shd w:val="clear" w:color="auto" w:fill="F5F3FF"/>
+          </w:tcPr>
+          <w:p>
+            <w:r>
+              <w:rPr>
+                <w:b/>
+                <w:color w:val="10B981"/>
+                <w:sz w:val="22"/>
+              </w:rPr>
+              <w:t xml:space="preserve">  Why Quantified Recovery Rates Make the AI Trustworthy:</w:t>
+            </w:r>
+          </w:p>
+          <w:p>
+            <w:r>
+              <w:rPr>
+                <w:color w:val="334155"/>
+                <w:sz w:val="21"/>
+              </w:rPr>
+              <w:t xml:space="preserve">  Many AI systems produce a risk label and stop there. The PharmaTrace approach goes further: it attaches expected recovery rates (55%, 82%, 96%) derived from industry benchmarks for each intervention type. This allows a CFO to say: 'If we act on the Critical zone today, we expect to recover 55 cents on every dollar at risk.' That quantified business case is what earns executive trust in an AI-driven recommendation — far more convincingly than a model accuracy statistic alone.</w:t>
+            </w:r>
+          </w:p>
+        </w:tc>
+      </w:tr>
+    </w:tbl>
+    <w:p/>
+    <w:p>
+      <w:pPr>
+        <w:pStyle w:val="Heading2"/>
+        <w:jc w:val="left"/>
+      </w:pPr>
+      <w:r>
+        <w:rPr>
+          <w:b/>
+          <w:color w:val="1F3864"/>
+        </w:rPr>
+        <w:t>9.4 Regulatory Auditability</w:t>
+      </w:r>
+    </w:p>
+    <w:p>
+      <w:pPr>
+        <w:spacing w:after="120" w:line="360" w:lineRule="auto"/>
+      </w:pPr>
+      <w:r>
+        <w:rPr>
+          <w:b w:val="0"/>
+          <w:i w:val="0"/>
+          <w:sz w:val="22"/>
+        </w:rPr>
+        <w:t>From an FDA/CDSCO audit perspective, XAI ensures the system is defensible:</w:t>
+      </w:r>
+    </w:p>
+    <w:p>
+      <w:pPr>
+        <w:pStyle w:val="ListBullet"/>
+        <w:spacing w:after="80"/>
+        <w:ind w:left="360"/>
+      </w:pPr>
+      <w:r>
+        <w:rPr>
+          <w:sz w:val="22"/>
+        </w:rPr>
+        <w:t>Every At-Risk classification is traceable to specific feature values (DTE, velocity, cover days) — not a black-box algorithm.</w:t>
+      </w:r>
+    </w:p>
+    <w:p>
+      <w:pPr>
+        <w:pStyle w:val="ListBullet"/>
+        <w:spacing w:after="80"/>
+        <w:ind w:left="360"/>
+      </w:pPr>
+      <w:r>
+        <w:rPr>
+          <w:sz w:val="22"/>
+        </w:rPr>
+        <w:t>The risk classification method (RAG-status, velocity pressure, or DTE quantile) is logged and displayed in the dashboard for every model run.</w:t>
+      </w:r>
+    </w:p>
+    <w:p>
+      <w:pPr>
+        <w:pStyle w:val="ListBullet"/>
+        <w:spacing w:after="80"/>
+        <w:ind w:left="360"/>
+      </w:pPr>
+      <w:r>
+        <w:rPr>
+          <w:sz w:val="22"/>
+        </w:rPr>
+        <w:t>Recovery zones have explicit, documented thresholds (DTE &lt;= 90, VP &gt; 1.0, etc.) that can be reviewed and approved by QA management.</w:t>
+      </w:r>
+    </w:p>
+    <w:p>
+      <w:pPr>
+        <w:pStyle w:val="ListBullet"/>
+        <w:spacing w:after="80"/>
+        <w:ind w:left="360"/>
+      </w:pPr>
+      <w:r>
+        <w:rPr>
+          <w:sz w:val="22"/>
+        </w:rPr>
+        <w:t>The probability score per batch is available in the batch-level output table, providing a documented audit trail of which batches were flagged and why.</w:t>
+      </w:r>
+    </w:p>
+    <w:p/>
+    <w:p>
+      <w:r>
+        <w:br w:type="page"/>
+      </w:r>
+    </w:p>
+    <w:p>
+      <w:pPr>
+        <w:pStyle w:val="Heading1"/>
+        <w:jc w:val="left"/>
+      </w:pPr>
+      <w:r>
+        <w:rPr>
+          <w:b/>
+          <w:color w:val="1F3864"/>
+        </w:rPr>
+        <w:t>10. Model Performance — How to Read the Metrics</w:t>
+      </w:r>
+    </w:p>
+    <w:p>
+      <w:pPr>
+        <w:pStyle w:val="Heading2"/>
+        <w:jc w:val="left"/>
+      </w:pPr>
+      <w:r>
+        <w:rPr>
+          <w:b/>
+          <w:color w:val="1F3864"/>
+        </w:rPr>
+        <w:t>10.1 Metric Definitions</w:t>
       </w:r>
     </w:p>
     <w:p>
@@ -3513,7 +5108,7 @@
           <w:b/>
           <w:color w:val="1F3864"/>
         </w:rPr>
-        <w:t>7.2 Reading the Confusion Matrix</w:t>
+        <w:t>10.2 Reading the Confusion Matrix</w:t>
       </w:r>
     </w:p>
     <w:tbl>
@@ -3722,7 +5317,7 @@
           <w:b/>
           <w:color w:val="1F3864"/>
         </w:rPr>
-        <w:t>8. Management Action Framework — By Probability Band</w:t>
+        <w:t>11. Management Action Framework — By Probability Band</w:t>
       </w:r>
     </w:p>
     <w:p>
@@ -4057,7 +5652,7 @@
           <w:b/>
           <w:color w:val="1F3864"/>
         </w:rPr>
-        <w:t>9. Limitations and Future Work</w:t>
+        <w:t>12. Limitations and Future Work</w:t>
       </w:r>
     </w:p>
     <w:p>
@@ -4070,7 +5665,7 @@
           <w:b/>
           <w:color w:val="1F3864"/>
         </w:rPr>
-        <w:t>9.1 Current Limitations</w:t>
+        <w:t>12.1 Current Limitations</w:t>
       </w:r>
     </w:p>
     <w:p>
@@ -4184,7 +5779,7 @@
           <w:b/>
           <w:color w:val="1F3864"/>
         </w:rPr>
-        <w:t>9.2 Future Enhancements</w:t>
+        <w:t>12.2 Future Enhancements</w:t>
       </w:r>
     </w:p>
     <w:p>
@@ -4302,7 +5897,7 @@
           <w:b/>
           <w:color w:val="1F3864"/>
         </w:rPr>
-        <w:t>10. Glossary of Key Terms</w:t>
+        <w:t>13. Glossary of Key Terms</w:t>
       </w:r>
     </w:p>
     <w:tbl>

</xml_diff>